<commit_message>
Add schematic diagrams (Figs 31.1-31.6) to Chapter 31
Co-Authored-By: Claude Sonnet 5.5 <noreply@anthropic.com>
Claude-Session: https://claude.ai/code/session_01SX8y58z5QxJJndgJuZf1Ph
</commit_message>
<xml_diff>
--- a/chapters/Chapter_31_Bioremediation.docx
+++ b/chapters/Chapter_31_Bioremediation.docx
@@ -2595,7 +2595,50 @@
     </w:p>
     <w:p>
       <w:pPr>
-        <w:spacing w:before="60" w:after="200"/>
+        <w:keepNext/>
+        <w:spacing w:before="160" w:after="60"/>
+        <w:jc w:val="center"/>
+      </w:pPr>
+      <w:r>
+        <w:drawing>
+          <wp:inline distT="0" distB="0" distL="0" distR="0">
+            <wp:extent cx="4480560" cy="2687533"/>
+            <wp:docPr id="101" name="Figure 31.1" descr="Schematic diagram: Engineering of soil bacterium for enhanced sequestration of toxic metals."/>
+            <wp:cNvGraphicFramePr>
+              <a:graphicFrameLocks xmlns:a="http://schemas.openxmlformats.org/drawingml/2006/main" noChangeAspect="1"/>
+            </wp:cNvGraphicFramePr>
+            <a:graphic xmlns:a="http://schemas.openxmlformats.org/drawingml/2006/main">
+              <a:graphicData uri="http://schemas.openxmlformats.org/drawingml/2006/picture">
+                <pic:pic xmlns:pic="http://schemas.openxmlformats.org/drawingml/2006/picture">
+                  <pic:nvPicPr>
+                    <pic:cNvPr id="101" name="fig31_1.png"/>
+                    <pic:cNvPicPr/>
+                  </pic:nvPicPr>
+                  <pic:blipFill>
+                    <a:blip r:embed="rIdFig1"/>
+                    <a:stretch>
+                      <a:fillRect/>
+                    </a:stretch>
+                  </pic:blipFill>
+                  <pic:spPr>
+                    <a:xfrm>
+                      <a:off x="0" y="0"/>
+                      <a:ext cx="4480560" cy="2687533"/>
+                    </a:xfrm>
+                    <a:prstGeom prst="rect">
+                      <a:avLst/>
+                    </a:prstGeom>
+                  </pic:spPr>
+                </pic:pic>
+              </a:graphicData>
+            </a:graphic>
+          </wp:inline>
+        </w:drawing>
+      </w:r>
+    </w:p>
+    <w:p>
+      <w:pPr>
+        <w:spacing w:before="0" w:after="200"/>
         <w:jc w:val="center"/>
         <w:rPr>
           <w:rFonts w:ascii="Times New Roman" w:eastAsia="Times New Roman" w:hAnsi="Times New Roman" w:cs="Times New Roman"/>
@@ -2895,7 +2938,50 @@
     </w:p>
     <w:p>
       <w:pPr>
-        <w:spacing w:before="60" w:after="200"/>
+        <w:keepNext/>
+        <w:spacing w:before="160" w:after="60"/>
+        <w:jc w:val="center"/>
+      </w:pPr>
+      <w:r>
+        <w:drawing>
+          <wp:inline distT="0" distB="0" distL="0" distR="0">
+            <wp:extent cx="4480560" cy="3092669"/>
+            <wp:docPr id="102" name="Figure 31.2" descr="Schematic diagram: A model for the possible routes for Cd accumulation within plants. (PC = phytochelatin)"/>
+            <wp:cNvGraphicFramePr>
+              <a:graphicFrameLocks xmlns:a="http://schemas.openxmlformats.org/drawingml/2006/main" noChangeAspect="1"/>
+            </wp:cNvGraphicFramePr>
+            <a:graphic xmlns:a="http://schemas.openxmlformats.org/drawingml/2006/main">
+              <a:graphicData uri="http://schemas.openxmlformats.org/drawingml/2006/picture">
+                <pic:pic xmlns:pic="http://schemas.openxmlformats.org/drawingml/2006/picture">
+                  <pic:nvPicPr>
+                    <pic:cNvPr id="102" name="fig31_2.png"/>
+                    <pic:cNvPicPr/>
+                  </pic:nvPicPr>
+                  <pic:blipFill>
+                    <a:blip r:embed="rIdFig2"/>
+                    <a:stretch>
+                      <a:fillRect/>
+                    </a:stretch>
+                  </pic:blipFill>
+                  <pic:spPr>
+                    <a:xfrm>
+                      <a:off x="0" y="0"/>
+                      <a:ext cx="4480560" cy="3092669"/>
+                    </a:xfrm>
+                    <a:prstGeom prst="rect">
+                      <a:avLst/>
+                    </a:prstGeom>
+                  </pic:spPr>
+                </pic:pic>
+              </a:graphicData>
+            </a:graphic>
+          </wp:inline>
+        </w:drawing>
+      </w:r>
+    </w:p>
+    <w:p>
+      <w:pPr>
+        <w:spacing w:before="0" w:after="200"/>
         <w:jc w:val="center"/>
         <w:rPr>
           <w:rFonts w:ascii="Times New Roman" w:eastAsia="Times New Roman" w:hAnsi="Times New Roman" w:cs="Times New Roman"/>
@@ -4999,7 +5085,50 @@
     </w:p>
     <w:p>
       <w:pPr>
-        <w:spacing w:before="60" w:after="200"/>
+        <w:keepNext/>
+        <w:spacing w:before="160" w:after="60"/>
+        <w:jc w:val="center"/>
+      </w:pPr>
+      <w:r>
+        <w:drawing>
+          <wp:inline distT="0" distB="0" distL="0" distR="0">
+            <wp:extent cx="4480560" cy="2956287"/>
+            <wp:docPr id="103" name="Figure 31.3" descr="Schematic diagram: Processes involved in the phytoextraction of contaminants from soils."/>
+            <wp:cNvGraphicFramePr>
+              <a:graphicFrameLocks xmlns:a="http://schemas.openxmlformats.org/drawingml/2006/main" noChangeAspect="1"/>
+            </wp:cNvGraphicFramePr>
+            <a:graphic xmlns:a="http://schemas.openxmlformats.org/drawingml/2006/main">
+              <a:graphicData uri="http://schemas.openxmlformats.org/drawingml/2006/picture">
+                <pic:pic xmlns:pic="http://schemas.openxmlformats.org/drawingml/2006/picture">
+                  <pic:nvPicPr>
+                    <pic:cNvPr id="103" name="fig31_3.png"/>
+                    <pic:cNvPicPr/>
+                  </pic:nvPicPr>
+                  <pic:blipFill>
+                    <a:blip r:embed="rIdFig3"/>
+                    <a:stretch>
+                      <a:fillRect/>
+                    </a:stretch>
+                  </pic:blipFill>
+                  <pic:spPr>
+                    <a:xfrm>
+                      <a:off x="0" y="0"/>
+                      <a:ext cx="4480560" cy="2956287"/>
+                    </a:xfrm>
+                    <a:prstGeom prst="rect">
+                      <a:avLst/>
+                    </a:prstGeom>
+                  </pic:spPr>
+                </pic:pic>
+              </a:graphicData>
+            </a:graphic>
+          </wp:inline>
+        </w:drawing>
+      </w:r>
+    </w:p>
+    <w:p>
+      <w:pPr>
+        <w:spacing w:before="0" w:after="200"/>
         <w:jc w:val="center"/>
         <w:rPr>
           <w:rFonts w:ascii="Times New Roman" w:eastAsia="Times New Roman" w:hAnsi="Times New Roman" w:cs="Times New Roman"/>
@@ -5355,7 +5484,50 @@
     </w:p>
     <w:p>
       <w:pPr>
-        <w:spacing w:before="60" w:after="200"/>
+        <w:keepNext/>
+        <w:spacing w:before="160" w:after="60"/>
+        <w:jc w:val="center"/>
+      </w:pPr>
+      <w:r>
+        <w:drawing>
+          <wp:inline distT="0" distB="0" distL="0" distR="0">
+            <wp:extent cx="4480560" cy="2956287"/>
+            <wp:docPr id="104" name="Figure 31.4" descr="Schematic diagram: Phytoremediation processes phytodegradation of organic compounds."/>
+            <wp:cNvGraphicFramePr>
+              <a:graphicFrameLocks xmlns:a="http://schemas.openxmlformats.org/drawingml/2006/main" noChangeAspect="1"/>
+            </wp:cNvGraphicFramePr>
+            <a:graphic xmlns:a="http://schemas.openxmlformats.org/drawingml/2006/main">
+              <a:graphicData uri="http://schemas.openxmlformats.org/drawingml/2006/picture">
+                <pic:pic xmlns:pic="http://schemas.openxmlformats.org/drawingml/2006/picture">
+                  <pic:nvPicPr>
+                    <pic:cNvPr id="104" name="fig31_4.png"/>
+                    <pic:cNvPicPr/>
+                  </pic:nvPicPr>
+                  <pic:blipFill>
+                    <a:blip r:embed="rIdFig4"/>
+                    <a:stretch>
+                      <a:fillRect/>
+                    </a:stretch>
+                  </pic:blipFill>
+                  <pic:spPr>
+                    <a:xfrm>
+                      <a:off x="0" y="0"/>
+                      <a:ext cx="4480560" cy="2956287"/>
+                    </a:xfrm>
+                    <a:prstGeom prst="rect">
+                      <a:avLst/>
+                    </a:prstGeom>
+                  </pic:spPr>
+                </pic:pic>
+              </a:graphicData>
+            </a:graphic>
+          </wp:inline>
+        </w:drawing>
+      </w:r>
+    </w:p>
+    <w:p>
+      <w:pPr>
+        <w:spacing w:before="0" w:after="200"/>
         <w:jc w:val="center"/>
         <w:rPr>
           <w:rFonts w:ascii="Times New Roman" w:eastAsia="Times New Roman" w:hAnsi="Times New Roman" w:cs="Times New Roman"/>
@@ -5460,7 +5632,50 @@
     </w:p>
     <w:p>
       <w:pPr>
-        <w:spacing w:before="60" w:after="200"/>
+        <w:keepNext/>
+        <w:spacing w:before="160" w:after="60"/>
+        <w:jc w:val="center"/>
+      </w:pPr>
+      <w:r>
+        <w:drawing>
+          <wp:inline distT="0" distB="0" distL="0" distR="0">
+            <wp:extent cx="4480560" cy="2687533"/>
+            <wp:docPr id="105" name="Figure 31.5" descr="Schematic diagram: Processes involved in the phytostabilization of contaminated soils."/>
+            <wp:cNvGraphicFramePr>
+              <a:graphicFrameLocks xmlns:a="http://schemas.openxmlformats.org/drawingml/2006/main" noChangeAspect="1"/>
+            </wp:cNvGraphicFramePr>
+            <a:graphic xmlns:a="http://schemas.openxmlformats.org/drawingml/2006/main">
+              <a:graphicData uri="http://schemas.openxmlformats.org/drawingml/2006/picture">
+                <pic:pic xmlns:pic="http://schemas.openxmlformats.org/drawingml/2006/picture">
+                  <pic:nvPicPr>
+                    <pic:cNvPr id="105" name="fig31_5.png"/>
+                    <pic:cNvPicPr/>
+                  </pic:nvPicPr>
+                  <pic:blipFill>
+                    <a:blip r:embed="rIdFig5"/>
+                    <a:stretch>
+                      <a:fillRect/>
+                    </a:stretch>
+                  </pic:blipFill>
+                  <pic:spPr>
+                    <a:xfrm>
+                      <a:off x="0" y="0"/>
+                      <a:ext cx="4480560" cy="2687533"/>
+                    </a:xfrm>
+                    <a:prstGeom prst="rect">
+                      <a:avLst/>
+                    </a:prstGeom>
+                  </pic:spPr>
+                </pic:pic>
+              </a:graphicData>
+            </a:graphic>
+          </wp:inline>
+        </w:drawing>
+      </w:r>
+    </w:p>
+    <w:p>
+      <w:pPr>
+        <w:spacing w:before="0" w:after="200"/>
         <w:jc w:val="center"/>
         <w:rPr>
           <w:rFonts w:ascii="Times New Roman" w:eastAsia="Times New Roman" w:hAnsi="Times New Roman" w:cs="Times New Roman"/>
@@ -6574,7 +6789,50 @@
     </w:p>
     <w:p>
       <w:pPr>
-        <w:spacing w:before="60" w:after="200"/>
+        <w:keepNext/>
+        <w:spacing w:before="160" w:after="60"/>
+        <w:jc w:val="center"/>
+      </w:pPr>
+      <w:r>
+        <w:drawing>
+          <wp:inline distT="0" distB="0" distL="0" distR="0">
+            <wp:extent cx="4480560" cy="2482960"/>
+            <wp:docPr id="106" name="Figure 31.6" descr="Schematic diagram: ArsC and γ-ECS catalysed reactions leading to the production of organic thiols, to which AsO&lt;sub&gt;3&lt;/sub&gt;&lt;sup&gt;3–&lt;/sup&gt; binds."/>
+            <wp:cNvGraphicFramePr>
+              <a:graphicFrameLocks xmlns:a="http://schemas.openxmlformats.org/drawingml/2006/main" noChangeAspect="1"/>
+            </wp:cNvGraphicFramePr>
+            <a:graphic xmlns:a="http://schemas.openxmlformats.org/drawingml/2006/main">
+              <a:graphicData uri="http://schemas.openxmlformats.org/drawingml/2006/picture">
+                <pic:pic xmlns:pic="http://schemas.openxmlformats.org/drawingml/2006/picture">
+                  <pic:nvPicPr>
+                    <pic:cNvPr id="106" name="fig31_6.png"/>
+                    <pic:cNvPicPr/>
+                  </pic:nvPicPr>
+                  <pic:blipFill>
+                    <a:blip r:embed="rIdFig6"/>
+                    <a:stretch>
+                      <a:fillRect/>
+                    </a:stretch>
+                  </pic:blipFill>
+                  <pic:spPr>
+                    <a:xfrm>
+                      <a:off x="0" y="0"/>
+                      <a:ext cx="4480560" cy="2482960"/>
+                    </a:xfrm>
+                    <a:prstGeom prst="rect">
+                      <a:avLst/>
+                    </a:prstGeom>
+                  </pic:spPr>
+                </pic:pic>
+              </a:graphicData>
+            </a:graphic>
+          </wp:inline>
+        </w:drawing>
+      </w:r>
+    </w:p>
+    <w:p>
+      <w:pPr>
+        <w:spacing w:before="0" w:after="200"/>
         <w:jc w:val="center"/>
         <w:rPr>
           <w:rFonts w:ascii="Times New Roman" w:eastAsia="Times New Roman" w:hAnsi="Times New Roman" w:cs="Times New Roman"/>

</xml_diff>